<commit_message>
Adicionando o restante dos links
</commit_message>
<xml_diff>
--- a/docs/Links_PI-KLION.docx
+++ b/docs/Links_PI-KLION.docx
@@ -716,19 +716,81 @@
         <w:br/>
       </w:r>
     </w:p>
-    <w:p xmlns:wp14="http://schemas.microsoft.com/office/word/2010/wordml" wp14:paraId="1E207724" wp14:textId="49FD059D">
-      <w:r>
-        <w:rPr>
-          <w:b w:val="1"/>
-          <w:bCs w:val="1"/>
-        </w:rPr>
-        <w:t>GitHub:</w:t>
+    <w:p>
+      <w:r>
+        <w:rPr>
+          <w:b w:val="1"/>
+          <w:bCs w:val="1"/>
+        </w:rPr>
+        <w:t xml:space="preserve">Link </w:t>
+      </w:r>
+      <w:r>
+        <w:rPr>
+          <w:b w:val="1"/>
+          <w:bCs w:val="1"/>
+        </w:rPr>
+        <w:t>GitHub</w:t>
+      </w:r>
+      <w:r>
+        <w:rPr>
+          <w:b w:val="1"/>
+          <w:bCs w:val="1"/>
+        </w:rPr>
+        <w:t xml:space="preserve"> PRINCIPAL</w:t>
+      </w:r>
+      <w:r>
+        <w:rPr>
+          <w:b w:val="1"/>
+          <w:bCs w:val="1"/>
+        </w:rPr>
+        <w:t xml:space="preserve"> (O que </w:t>
+      </w:r>
+      <w:r>
+        <w:rPr>
+          <w:b w:val="1"/>
+          <w:bCs w:val="1"/>
+        </w:rPr>
+        <w:t>contém</w:t>
+      </w:r>
+      <w:r>
+        <w:rPr>
+          <w:b w:val="1"/>
+          <w:bCs w:val="1"/>
+        </w:rPr>
+        <w:t xml:space="preserve"> todos os </w:t>
+      </w:r>
+      <w:r>
+        <w:rPr>
+          <w:b w:val="1"/>
+          <w:bCs w:val="1"/>
+        </w:rPr>
+        <w:t>commits</w:t>
+      </w:r>
+      <w:r>
+        <w:rPr>
+          <w:b w:val="1"/>
+          <w:bCs w:val="1"/>
+        </w:rPr>
+        <w:t xml:space="preserve"> ao longo do desenvolvimento)</w:t>
+      </w:r>
+      <w:r>
+        <w:rPr>
+          <w:b w:val="1"/>
+          <w:bCs w:val="1"/>
+        </w:rPr>
+        <w:t>:</w:t>
+      </w:r>
+    </w:p>
+    <w:p>
+      <w:r>
+        <w:rPr/>
+        <w:t>Miguel Macedo Martins:</w:t>
       </w:r>
       <w:r>
         <w:rPr/>
         <w:t xml:space="preserve"> </w:t>
       </w:r>
-      <w:hyperlink r:id="R206b1748dfed4438">
+      <w:hyperlink r:id="R00ec0b4579f245cc">
         <w:r>
           <w:rPr>
             <w:rStyle w:val="Hyperlink"/>
@@ -738,57 +800,193 @@
       </w:hyperlink>
     </w:p>
     <w:p/>
-    <w:p w14:noSpellErr="1">
-      <w:r>
-        <w:rPr>
-          <w:b w:val="1"/>
-          <w:bCs w:val="1"/>
-        </w:rPr>
-        <w:t>V</w:t>
-      </w:r>
-      <w:r>
-        <w:rPr>
-          <w:b w:val="1"/>
-          <w:bCs w:val="1"/>
-        </w:rPr>
-        <w:t>í</w:t>
-      </w:r>
-      <w:r>
-        <w:rPr>
-          <w:b w:val="1"/>
-          <w:bCs w:val="1"/>
-        </w:rPr>
-        <w:t>deo</w:t>
-      </w:r>
-      <w:r>
-        <w:rPr>
-          <w:b w:val="1"/>
-          <w:bCs w:val="1"/>
-        </w:rPr>
-        <w:t xml:space="preserve"> </w:t>
-      </w:r>
-      <w:r>
-        <w:rPr>
-          <w:b w:val="1"/>
-          <w:bCs w:val="1"/>
-        </w:rPr>
-        <w:t>Pitch</w:t>
-      </w:r>
-      <w:r>
-        <w:rPr>
-          <w:b w:val="1"/>
-          <w:bCs w:val="1"/>
-        </w:rPr>
-        <w:t>:</w:t>
-      </w:r>
-      <w:r>
-        <w:rPr/>
-        <w:t xml:space="preserve"> </w:t>
-      </w:r>
-      <w:hyperlink r:id="Re49c3e27677e495a">
+    <w:p>
+      <w:pPr>
+        <w:rPr>
+          <w:b w:val="1"/>
+          <w:bCs w:val="1"/>
+        </w:rPr>
+      </w:pPr>
+      <w:r>
+        <w:rPr>
+          <w:b w:val="1"/>
+          <w:bCs w:val="1"/>
+        </w:rPr>
+        <w:t>Links dos outros Integrantes:</w:t>
+      </w:r>
+    </w:p>
+    <w:p>
+      <w:pPr>
+        <w:rPr>
+          <w:b w:val="0"/>
+          <w:bCs w:val="0"/>
+        </w:rPr>
+      </w:pPr>
+      <w:r>
+        <w:rPr>
+          <w:b w:val="0"/>
+          <w:bCs w:val="0"/>
+        </w:rPr>
+        <w:t xml:space="preserve">Rafael Silva Machado: </w:t>
+      </w:r>
+      <w:hyperlink r:id="Rb086127dc5d74e48">
         <w:r>
           <w:rPr>
             <w:rStyle w:val="Hyperlink"/>
+            <w:b w:val="0"/>
+            <w:bCs w:val="0"/>
+          </w:rPr>
+          <w:t>https://github.com/R4faelSilva/Projeto-Integracao-KLION-2DSM-V2</w:t>
+        </w:r>
+      </w:hyperlink>
+    </w:p>
+    <w:p>
+      <w:pPr>
+        <w:rPr>
+          <w:b w:val="0"/>
+          <w:bCs w:val="0"/>
+        </w:rPr>
+      </w:pPr>
+      <w:r>
+        <w:rPr>
+          <w:b w:val="0"/>
+          <w:bCs w:val="0"/>
+        </w:rPr>
+        <w:t xml:space="preserve">Gabriel </w:t>
+      </w:r>
+      <w:r>
+        <w:rPr>
+          <w:b w:val="0"/>
+          <w:bCs w:val="0"/>
+        </w:rPr>
+        <w:t>Povidaiko</w:t>
+      </w:r>
+      <w:r>
+        <w:rPr>
+          <w:b w:val="0"/>
+          <w:bCs w:val="0"/>
+        </w:rPr>
+        <w:t xml:space="preserve"> </w:t>
+      </w:r>
+      <w:r>
+        <w:rPr>
+          <w:b w:val="0"/>
+          <w:bCs w:val="0"/>
+        </w:rPr>
+        <w:t xml:space="preserve">Suto de Morais: </w:t>
+      </w:r>
+      <w:hyperlink r:id="Ra0bb37524096474c">
+        <w:r>
+          <w:rPr>
+            <w:rStyle w:val="Hyperlink"/>
+            <w:b w:val="0"/>
+            <w:bCs w:val="0"/>
+          </w:rPr>
+          <w:t>https://github.com/Povidaiko/P.I-2DSM-Projeto-KLion-2026</w:t>
+        </w:r>
+      </w:hyperlink>
+    </w:p>
+    <w:p>
+      <w:pPr>
+        <w:rPr>
+          <w:b w:val="0"/>
+          <w:bCs w:val="0"/>
+        </w:rPr>
+      </w:pPr>
+      <w:r>
+        <w:rPr>
+          <w:b w:val="0"/>
+          <w:bCs w:val="0"/>
+        </w:rPr>
+        <w:t>André Joaquim Santana da Silva:</w:t>
+      </w:r>
+      <w:r>
+        <w:rPr>
+          <w:b w:val="0"/>
+          <w:bCs w:val="0"/>
+        </w:rPr>
+        <w:t xml:space="preserve"> </w:t>
+      </w:r>
+      <w:hyperlink r:id="R9340b01e770d494b">
+        <w:r>
+          <w:rPr>
+            <w:rStyle w:val="Hyperlink"/>
+            <w:b w:val="0"/>
+            <w:bCs w:val="0"/>
+          </w:rPr>
+          <w:t>https://github.com/Andre-Joaquim/Klion-DSM-P.I</w:t>
+        </w:r>
+      </w:hyperlink>
+    </w:p>
+    <w:p>
+      <w:pPr>
+        <w:rPr>
+          <w:b w:val="0"/>
+          <w:bCs w:val="0"/>
+        </w:rPr>
+      </w:pPr>
+    </w:p>
+    <w:p/>
+    <w:p>
+      <w:r>
+        <w:rPr>
+          <w:b w:val="1"/>
+          <w:bCs w:val="1"/>
+          <w:lang w:val="en-US"/>
+        </w:rPr>
+        <w:t>V</w:t>
+      </w:r>
+      <w:r>
+        <w:rPr>
+          <w:b w:val="1"/>
+          <w:bCs w:val="1"/>
+          <w:lang w:val="en-US"/>
+        </w:rPr>
+        <w:t>í</w:t>
+      </w:r>
+      <w:r>
+        <w:rPr>
+          <w:b w:val="1"/>
+          <w:bCs w:val="1"/>
+          <w:lang w:val="en-US"/>
+        </w:rPr>
+        <w:t>deo</w:t>
+      </w:r>
+      <w:r>
+        <w:rPr>
+          <w:b w:val="1"/>
+          <w:bCs w:val="1"/>
+          <w:lang w:val="en-US"/>
+        </w:rPr>
+        <w:t xml:space="preserve"> </w:t>
+      </w:r>
+      <w:r>
+        <w:rPr>
+          <w:b w:val="1"/>
+          <w:bCs w:val="1"/>
+          <w:lang w:val="en-US"/>
+        </w:rPr>
+        <w:t>Pitch</w:t>
+      </w:r>
+      <w:r>
+        <w:rPr>
+          <w:b w:val="1"/>
+          <w:bCs w:val="1"/>
+          <w:lang w:val="en-US"/>
+        </w:rPr>
+        <w:t>:</w:t>
+      </w:r>
+      <w:r>
+        <w:rPr>
+          <w:lang w:val="en-US"/>
+        </w:rPr>
+        <w:t xml:space="preserve"> </w:t>
+      </w:r>
+      <w:hyperlink r:id="R18b38ecd7a7e4775">
+        <w:r>
+          <w:rPr>
+            <w:rStyle w:val="Hyperlink"/>
+            <w:lang w:val="en-US"/>
           </w:rPr>
           <w:t>https://www.youtube.com/watch?v=xZ_rWjJkKL4&amp;feature=youtu.be</w:t>
         </w:r>

</xml_diff>